<commit_message>
Resumes: 1.5-page set (Nunito layout, education, awards) as send-ready PDFs; refresh one-pagers
</commit_message>
<xml_diff>
--- a/Resumes/2026/resume-cpp-systems-1page.docx
+++ b/Resumes/2026/resume-cpp-systems-1page.docx
@@ -206,7 +206,7 @@
           <w:color w:val="3C78D8"/>
           <w:sz w:val="22"/>
         </w:rPr>
-        <w:t>SUMMARY</w:t>
+        <w:t xml:space="preserve">SUMMARY</w:t>
       </w:r>
     </w:p>
     <w:p>
@@ -215,7 +215,7 @@
       </w:pPr>
       <w:r>
         <w:rPr/>
-        <w:t>Staff engineer with 11 years of building large, long-lived C++ systems at Synopsys, Microsoft and Adobe. I own the coverage subsystems of a formal-verification product end to end, lead architecture changes across team boundaries, and build LLVM-based program analysis.</w:t>
+        <w:t xml:space="preserve">Staff engineer with 11 years of C++ systems at Synopsys, Microsoft and Adobe. I own the coverage subsystems of a formal-verification product, lead cross-team architecture changes, and build LLVM program analysis and AI agents for the team.</w:t>
       </w:r>
     </w:p>
     <w:p>
@@ -232,7 +232,7 @@
           <w:color w:val="3C78D8"/>
           <w:sz w:val="22"/>
         </w:rPr>
-        <w:t>SKILLS</w:t>
+        <w:t xml:space="preserve">SKILLS</w:t>
       </w:r>
     </w:p>
     <w:p>
@@ -243,7 +243,7 @@
         <w:rPr>
           <w:b/>
         </w:rPr>
-        <w:t>Languages:</w:t>
+        <w:t xml:space="preserve">Languages:</w:t>
       </w:r>
       <w:r>
         <w:rPr/>
@@ -258,7 +258,7 @@
         <w:rPr>
           <w:b/>
         </w:rPr>
-        <w:t>Domain:</w:t>
+        <w:t xml:space="preserve">Domain:</w:t>
       </w:r>
       <w:r>
         <w:rPr/>
@@ -273,11 +273,11 @@
         <w:rPr>
           <w:b/>
         </w:rPr>
-        <w:t>Systems and tools:</w:t>
+        <w:t xml:space="preserve">Systems and tools:</w:t>
       </w:r>
       <w:r>
         <w:rPr/>
-        <w:t xml:space="preserve"> dependency inversion, IWYU, LLVM IR passes (dg), master/worker orchestration, serialization (XML, pugixml), Verdi, FlexNet, LSF, GDB, Linux, Perforce, Git, Win32</w:t>
+        <w:t xml:space="preserve"> dependency inversion, IWYU, LLVM IR passes (dg), master/worker orchestration, XML (pugixml), Verdi, LSF, GDB, Linux, Perforce, Git, Win32</w:t>
       </w:r>
     </w:p>
     <w:p>
@@ -288,11 +288,11 @@
         <w:rPr>
           <w:b/>
         </w:rPr>
-        <w:t>AI tooling:</w:t>
+        <w:t xml:space="preserve">AI tooling:</w:t>
       </w:r>
       <w:r>
         <w:rPr/>
-        <w:t xml:space="preserve"> Cursor agent skills, rules and subagents built for the team's workflow, shared with the team</w:t>
+        <w:t xml:space="preserve"> Cursor agents, skills, rules and subagents</w:t>
       </w:r>
     </w:p>
     <w:p>
@@ -309,14 +309,14 @@
           <w:color w:val="3C78D8"/>
           <w:sz w:val="22"/>
         </w:rPr>
-        <w:t>EXPERIENCE</w:t>
+        <w:t xml:space="preserve">EXPERIENCE</w:t>
       </w:r>
     </w:p>
     <w:p>
       <w:pPr>
         <w:keepNext/>
         <w:tabs>
-          <w:tab w:pos="10178" w:val="right"/>
+          <w:tab w:pos="10466" w:val="right"/>
         </w:tabs>
         <w:spacing w:before="80" w:after="0"/>
       </w:pPr>
@@ -324,7 +324,7 @@
         <w:rPr>
           <w:b/>
         </w:rPr>
-        <w:t>R&amp;D Staff Engineer  |  Synopsys</w:t>
+        <w:t xml:space="preserve">R&amp;D Staff Engineer  |  Synopsys</w:t>
       </w:r>
       <w:r>
         <w:tab/>
@@ -333,7 +333,7 @@
         <w:rPr>
           <w:i/>
         </w:rPr>
-        <w:t>Noida, India  |  May 2023 - Present</w:t>
+        <w:t xml:space="preserve">Noida, India  |  May 2023 - Present</w:t>
       </w:r>
     </w:p>
     <w:p>
@@ -346,7 +346,7 @@
           <w:i/>
           <w:sz w:val="19"/>
         </w:rPr>
-        <w:t>VC Formal (formal verification), DPV app: C++ vs RTL equivalence</w:t>
+        <w:t xml:space="preserve">VC Formal (formal verification), DPV app: C++ vs RTL equivalence</w:t>
       </w:r>
     </w:p>
     <w:p>
@@ -362,11 +362,11 @@
         <w:rPr>
           <w:b/>
         </w:rPr>
-        <w:t>Build-dependency decoupling (multi-org initiative)</w:t>
+        <w:t xml:space="preserve">Build-dependency decoupling (multi-org initiative)</w:t>
       </w:r>
       <w:r>
         <w:rPr/>
-        <w:t>: led VC Formal's part. The shared C++ layer under every app included engine headers, so one engine edit rebuilt every app. Cut wrong-way dependencies ~73% with include-what-you-use, hide-what-you-use (forward declarations), dependency inversion through startup-injected callbacks, and relocating misplaced code, rolled out in small reviewed changes to another team's code and shipped to production. Shared the design with the wider org in a tech talk.</w:t>
+        <w:t xml:space="preserve">: led VC Formal's part. The shared C++ layer under ~15 apps and tools included engine headers, so one engine edit rebuilt every app. Cut wrong-way dependencies ~73% with include-what-you-use, hide-what-you-use (forward declarations), dependency inversion through startup-injected callbacks, and code relocation, in small changes reviewed by the owning teams; in production. Org-wide tech talk on the design.</w:t>
       </w:r>
     </w:p>
     <w:p>
@@ -382,11 +382,11 @@
         <w:rPr>
           <w:b/>
         </w:rPr>
-        <w:t>C++ code coverage</w:t>
+        <w:t xml:space="preserve">C++ code coverage</w:t>
       </w:r>
       <w:r>
         <w:rPr/>
-        <w:t>: own it end to end. It shows which parts of a C++ model the formal proofs actually exercised, so C++ can be signed off like RTL. Added merging across proofs and export to the standard coverage database, so C++ and RTL coverage are reviewed together in one viewer; drive changes with the viewer and GUI teams, handle customer issues, and guided its integration into a new C++ + RTL sign-off app.</w:t>
+        <w:t xml:space="preserve">: own it end to end. It shows which parts of a C++ model the formal proofs actually exercised, so C++ can be signed off like RTL. Added merging across proofs and export to the standard coverage database, so C++ and RTL coverage are reviewed together in one viewer; handle customer issues and guided its integration into a new C++ + RTL sign-off app.</w:t>
       </w:r>
     </w:p>
     <w:p>
@@ -402,11 +402,11 @@
         <w:rPr>
           <w:b/>
         </w:rPr>
-        <w:t>C++ program slicer (customer-requested R&amp;D)</w:t>
+        <w:t xml:space="preserve">C++ program slicer (customer-requested R&amp;D)</w:t>
       </w:r>
       <w:r>
         <w:rPr/>
-        <w:t>: building source-level cone of influence for C++ designs, which reports the exact C++ lines a property depends on. Built on the open-source dg LLVM slicer: wrote LLVM IR passes for C++ constructs it missed and a signal-based slicing criterion that cut whole-file slices down to the lines feeding each signal. Design reviewed weekly with a Distinguished Engineer.</w:t>
+        <w:t xml:space="preserve">: building source-level cone of influence for C++ designs, which reports the exact C++ lines a property depends on. Built on the open-source dg LLVM slicer: wrote LLVM IR passes for C++ constructs it missed and a signal-based slicing criterion that cut whole-file slices down to the lines feeding each signal. Design reviewed weekly with a Distinguished Engineer.</w:t>
       </w:r>
     </w:p>
     <w:p>
@@ -422,11 +422,11 @@
         <w:rPr>
           <w:b/>
         </w:rPr>
-        <w:t>Formal coverage (property density, RTL coverage)</w:t>
+        <w:t xml:space="preserve">Formal coverage (property density, RTL coverage)</w:t>
       </w:r>
       <w:r>
         <w:rPr/>
-        <w:t>: own both. They report which design signals, down to the bit, and which RTL lines the properties actually check. Rebuilt property density on the shared design model so DPV and FPV give the same answer, adding bit-level detail and RTL-to-RTL designs; aligned RTL coverage semantics across the two apps. In production.</w:t>
+        <w:t xml:space="preserve">: own both. They report which design signals, down to the bit, and which RTL lines the properties actually check. Rebuilt property density on the shared design model so DPV and FPV give the same answer, adding bit-level detail and RTL-to-RTL designs; aligned RTL coverage semantics across the two apps. In production.</w:t>
       </w:r>
     </w:p>
     <w:p>
@@ -442,11 +442,11 @@
         <w:rPr>
           <w:b/>
         </w:rPr>
-        <w:t>Licensing for a distributed solver</w:t>
+        <w:t xml:space="preserve">Licensing for a distributed solver</w:t>
       </w:r>
       <w:r>
         <w:rPr/>
-        <w:t>: built token licensing in the C++ proof engine and moved runtime license checkout from workers to the orchestration master, so one process owns keys for every tier and each key serves more workers; fixed production checkout failures across license servers.</w:t>
+        <w:t xml:space="preserve">: built token licensing in the C++ proof engine and moved runtime license checkout from workers to the orchestration master, so each key serves more workers; fixed production checkout failures across license servers.</w:t>
       </w:r>
     </w:p>
     <w:p>
@@ -462,35 +462,11 @@
         <w:rPr>
           <w:b/>
         </w:rPr>
-        <w:t>Session save/restore (serialization)</w:t>
+        <w:t xml:space="preserve">Customer escalations</w:t>
       </w:r>
       <w:r>
         <w:rPr/>
-        <w:t>: extended snapshots to capture state that was silently lost on restore (user Tcl procedures, engine problem state as XML), and kept new features' state persistent with round-trip tests.</w:t>
-      </w:r>
-    </w:p>
-    <w:p>
-      <w:pPr>
-        <w:keepNext/>
-        <w:tabs>
-          <w:tab w:pos="10178" w:val="right"/>
-        </w:tabs>
-        <w:spacing w:before="80" w:after="0"/>
-      </w:pPr>
-      <w:r>
-        <w:rPr>
-          <w:b/>
-        </w:rPr>
-        <w:t>Software Engineer II  |  Microsoft</w:t>
-      </w:r>
-      <w:r>
-        <w:tab/>
-      </w:r>
-      <w:r>
-        <w:rPr>
-          <w:i/>
-        </w:rPr>
-        <w:t>Noida, India  |  May 2021 - May 2023</w:t>
+        <w:t xml:space="preserve">: own them end to end in my areas: root cause, regression test, fix shipped in service packs.</w:t>
       </w:r>
     </w:p>
     <w:p>
@@ -500,7 +476,17 @@
       </w:pPr>
       <w:r>
         <w:rPr/>
-        <w:t>- Owned Recording Studio features in PowerPoint Win32 (C++): camera modes, live background blur, video export and Cameo, a camera object placed on the slide. Led v1 test automation and wired Recording and Export telemetry.</w:t>
+        <w:t xml:space="preserve">- </w:t>
+      </w:r>
+      <w:r>
+        <w:rPr>
+          <w:b/>
+        </w:rPr>
+        <w:t xml:space="preserve">AI agents for the team's workflow</w:t>
+      </w:r>
+      <w:r>
+        <w:rPr/>
+        <w:t xml:space="preserve">: built Cursor agents teammates use: a daily Jira check that flags tickets with wrong validation fields and notifies owners, and an agent that reproduces a Jira issue, root-causes it and drafts a fix as a code review for an engineer to check.</w:t>
       </w:r>
     </w:p>
     <w:p>
@@ -510,7 +496,41 @@
       </w:pPr>
       <w:r>
         <w:rPr/>
-        <w:t>- Designed catalog filtering plus an allowlist (C#) so new commerce SKUs no longer broke OneDrive's upgrade path.</w:t>
+        <w:t xml:space="preserve">- </w:t>
+      </w:r>
+      <w:r>
+        <w:rPr>
+          <w:b/>
+        </w:rPr>
+        <w:t xml:space="preserve">Session save/restore</w:t>
+      </w:r>
+      <w:r>
+        <w:rPr/>
+        <w:t xml:space="preserve">: closed silent state-loss gaps (user Tcl procedures, engine state as XML), with round-trip tests.</w:t>
+      </w:r>
+    </w:p>
+    <w:p>
+      <w:pPr>
+        <w:keepNext/>
+        <w:tabs>
+          <w:tab w:pos="10466" w:val="right"/>
+        </w:tabs>
+        <w:spacing w:before="80" w:after="0"/>
+      </w:pPr>
+      <w:r>
+        <w:rPr>
+          <w:b/>
+        </w:rPr>
+        <w:t xml:space="preserve">Software Engineer II  |  Microsoft</w:t>
+      </w:r>
+      <w:r>
+        <w:tab/>
+      </w:r>
+      <w:r>
+        <w:rPr>
+          <w:i/>
+        </w:rPr>
+        <w:t xml:space="preserve">Noida, India  |  May 2021 - May 2023</w:t>
       </w:r>
     </w:p>
     <w:p>
@@ -520,44 +540,11 @@
       </w:pPr>
       <w:r>
         <w:rPr/>
-        <w:t>- Built the Stream 2.0 video playback component in Excel Win32 (C++, TypeScript) for SharePoint and OneDrive video.</w:t>
-      </w:r>
-    </w:p>
-    <w:p>
-      <w:pPr>
-        <w:keepNext/>
-        <w:tabs>
-          <w:tab w:pos="10178" w:val="right"/>
-        </w:tabs>
-        <w:spacing w:before="80" w:after="0"/>
-      </w:pPr>
-      <w:r>
-        <w:rPr>
-          <w:b/>
-        </w:rPr>
-        <w:t>Software Development Engineer 2  |  Adobe</w:t>
+        <w:t xml:space="preserve">- </w:t>
       </w:r>
       <w:r>
-        <w:tab/>
-      </w:r>
-      <w:r>
-        <w:rPr>
-          <w:i/>
-        </w:rPr>
-        <w:t>Noida, India  |  Aug 2015 - Apr 2021</w:t>
-      </w:r>
-    </w:p>
-    <w:p>
-      <w:pPr>
-        <w:keepNext/>
-        <w:spacing w:after="0"/>
-      </w:pPr>
-      <w:r>
-        <w:rPr>
-          <w:i/>
-          <w:sz w:val="19"/>
-        </w:rPr>
-        <w:t>Software Engineer Aug 2015 - Jan 2017; SDE 2 from Jan 2017</w:t>
+        <w:rPr/>
+        <w:t xml:space="preserve">Owned Recording Studio features in PowerPoint Win32 (C++): camera modes, live background blur, video export and Cameo, a camera object placed on the slide. Led v1 test automation and wired Recording and Export telemetry.</w:t>
       </w:r>
     </w:p>
     <w:p>
@@ -567,7 +554,11 @@
       </w:pPr>
       <w:r>
         <w:rPr/>
-        <w:t>- Moved Photoshop Elements and Premiere Elements from RIBS to Hyperdrive builds with parallel install bundles, cutting install time ~50% on average. Spot Award.</w:t>
+        <w:t xml:space="preserve">- </w:t>
+      </w:r>
+      <w:r>
+        <w:rPr/>
+        <w:t xml:space="preserve">Designed catalog filtering plus an allowlist (C#) so new commerce SKUs no longer broke OneDrive's upgrade path.</w:t>
       </w:r>
     </w:p>
     <w:p>
@@ -577,7 +568,63 @@
       </w:pPr>
       <w:r>
         <w:rPr/>
-        <w:t>- Designed lazy loading for large files in the AEM web editor, cutting load time ~60% on files customers reported as freezing.</w:t>
+        <w:t xml:space="preserve">- </w:t>
+      </w:r>
+      <w:r>
+        <w:rPr/>
+        <w:t xml:space="preserve">Built the Stream 2.0 video playback component in Excel Win32 (C++, TypeScript) for SharePoint and OneDrive video.</w:t>
+      </w:r>
+    </w:p>
+    <w:p>
+      <w:pPr>
+        <w:keepNext/>
+        <w:tabs>
+          <w:tab w:pos="10466" w:val="right"/>
+        </w:tabs>
+        <w:spacing w:before="80" w:after="0"/>
+      </w:pPr>
+      <w:r>
+        <w:rPr>
+          <w:b/>
+        </w:rPr>
+        <w:t xml:space="preserve">Software Development Engineer 2  |  Adobe</w:t>
+      </w:r>
+      <w:r>
+        <w:tab/>
+      </w:r>
+      <w:r>
+        <w:rPr>
+          <w:i/>
+        </w:rPr>
+        <w:t xml:space="preserve">Noida, India  |  Aug 2015 - Apr 2021</w:t>
+      </w:r>
+    </w:p>
+    <w:p>
+      <w:pPr>
+        <w:spacing w:after="20"/>
+        <w:ind w:left="288" w:hanging="216"/>
+      </w:pPr>
+      <w:r>
+        <w:rPr/>
+        <w:t xml:space="preserve">- </w:t>
+      </w:r>
+      <w:r>
+        <w:rPr/>
+        <w:t xml:space="preserve">Moved Photoshop and Premiere Elements from RIBS to Hyperdrive builds with parallel bundles, cutting install time ~50%.</w:t>
+      </w:r>
+    </w:p>
+    <w:p>
+      <w:pPr>
+        <w:spacing w:after="20"/>
+        <w:ind w:left="288" w:hanging="216"/>
+      </w:pPr>
+      <w:r>
+        <w:rPr/>
+        <w:t xml:space="preserve">- </w:t>
+      </w:r>
+      <w:r>
+        <w:rPr/>
+        <w:t xml:space="preserve">Designed lazy loading for large files in the AEM web editor, cutting load time ~60% on files customers reported as freezing.</w:t>
       </w:r>
     </w:p>
     <w:p>
@@ -594,7 +641,7 @@
           <w:color w:val="3C78D8"/>
           <w:sz w:val="22"/>
         </w:rPr>
-        <w:t>EDUCATION</w:t>
+        <w:t xml:space="preserve">EDUCATION AND AWARDS</w:t>
       </w:r>
     </w:p>
     <w:p>
@@ -603,12 +650,21 @@
       </w:pPr>
       <w:r>
         <w:rPr/>
-        <w:t>B.Tech, Computer Science and Engineering - NIT Bhopal (MANIT) | 2011 - 2015 | GPA 8.27/10</w:t>
+        <w:t xml:space="preserve">Spot Awards, Synopsys (latest Sep 2026, org all-hands) | Spot Award, Adobe (RIBS to Hyperdrive migration)</w:t>
+      </w:r>
+    </w:p>
+    <w:p>
+      <w:pPr>
+        <w:spacing w:after="40"/>
+      </w:pPr>
+      <w:r>
+        <w:rPr/>
+        <w:t xml:space="preserve">B.Tech, Computer Science and Engineering - NIT Bhopal (MANIT) | 2011 - 2015 | GPA 8.27/10</w:t>
       </w:r>
     </w:p>
     <w:sectPr>
       <w:pgSz w:w="11906" w:h="16838"/>
-      <w:pgMar w:top="720" w:right="864" w:bottom="720" w:left="864" w:header="720" w:footer="720" w:gutter="0"/>
+      <w:pgMar w:top="720" w:right="720" w:bottom="720" w:left="720" w:header="720" w:footer="720" w:gutter="0"/>
       <w:cols w:space="720"/>
       <w:docGrid w:linePitch="360"/>
     </w:sectPr>

</xml_diff>